<commit_message>
display simple content in page
</commit_message>
<xml_diff>
--- a/next-js-doc.docx
+++ b/next-js-doc.docx
@@ -9,6 +9,68 @@
       <w:r>
         <w:t>Next JS tutorial in Hindi #3 First Program | Component | Hello World</w:t>
       </w:r>
+    </w:p>
+    <w:p/>
+    <w:p>
+      <w:r>
+        <w:drawing>
+          <wp:inline distT="0" distB="0" distL="0" distR="0" wp14:anchorId="3AF7FFB0" wp14:editId="6DA8615E">
+            <wp:extent cx="5731510" cy="3243580"/>
+            <wp:effectExtent l="0" t="0" r="2540" b="0"/>
+            <wp:docPr id="931519929" name="Picture 1"/>
+            <wp:cNvGraphicFramePr>
+              <a:graphicFrameLocks xmlns:a="http://schemas.openxmlformats.org/drawingml/2006/main" noChangeAspect="1"/>
+            </wp:cNvGraphicFramePr>
+            <a:graphic xmlns:a="http://schemas.openxmlformats.org/drawingml/2006/main">
+              <a:graphicData uri="http://schemas.openxmlformats.org/drawingml/2006/picture">
+                <pic:pic xmlns:pic="http://schemas.openxmlformats.org/drawingml/2006/picture">
+                  <pic:nvPicPr>
+                    <pic:cNvPr id="931519929" name=""/>
+                    <pic:cNvPicPr/>
+                  </pic:nvPicPr>
+                  <pic:blipFill>
+                    <a:blip r:embed="rId4"/>
+                    <a:stretch>
+                      <a:fillRect/>
+                    </a:stretch>
+                  </pic:blipFill>
+                  <pic:spPr>
+                    <a:xfrm>
+                      <a:off x="0" y="0"/>
+                      <a:ext cx="5731510" cy="3243580"/>
+                    </a:xfrm>
+                    <a:prstGeom prst="rect">
+                      <a:avLst/>
+                    </a:prstGeom>
+                  </pic:spPr>
+                </pic:pic>
+              </a:graphicData>
+            </a:graphic>
+          </wp:inline>
+        </w:drawing>
+      </w:r>
+    </w:p>
+    <w:p/>
+    <w:p/>
+    <w:p>
+      <w:r>
+        <w:t>Browser don’t understand the typescript.</w:t>
+      </w:r>
+    </w:p>
+    <w:p>
+      <w:pPr>
+        <w:pStyle w:val="Heading2"/>
+      </w:pPr>
+      <w:r>
+        <w:t xml:space="preserve">Next JS tutorial in Hindi #4 Events | Functions | state in </w:t>
+      </w:r>
+      <w:proofErr w:type="spellStart"/>
+      <w:proofErr w:type="gramStart"/>
+      <w:r>
+        <w:t>next.Js</w:t>
+      </w:r>
+      <w:proofErr w:type="spellEnd"/>
+      <w:proofErr w:type="gramEnd"/>
     </w:p>
     <w:p/>
     <w:sectPr>

</xml_diff>

<commit_message>
adding code for rendering different types of components
</commit_message>
<xml_diff>
--- a/next-js-doc.docx
+++ b/next-js-doc.docx
@@ -71,6 +71,104 @@
       </w:r>
       <w:proofErr w:type="spellEnd"/>
       <w:proofErr w:type="gramEnd"/>
+    </w:p>
+    <w:p>
+      <w:r>
+        <w:t xml:space="preserve">Use-client must be top of the page where we are using the components as client don’t make it in </w:t>
+      </w:r>
+      <w:proofErr w:type="gramStart"/>
+      <w:r>
+        <w:t>other</w:t>
+      </w:r>
+      <w:proofErr w:type="gramEnd"/>
+      <w:r>
+        <w:t xml:space="preserve"> place it </w:t>
+      </w:r>
+    </w:p>
+    <w:p>
+      <w:r>
+        <w:t xml:space="preserve">When ever we declare a variable in </w:t>
+      </w:r>
+      <w:proofErr w:type="spellStart"/>
+      <w:r>
+        <w:t>js</w:t>
+      </w:r>
+      <w:proofErr w:type="spellEnd"/>
+      <w:r>
+        <w:t xml:space="preserve"> then it </w:t>
+      </w:r>
+      <w:proofErr w:type="gramStart"/>
+      <w:r>
+        <w:t>don’t</w:t>
+      </w:r>
+      <w:proofErr w:type="gramEnd"/>
+      <w:r>
+        <w:t xml:space="preserve"> re-render the component but when we declare or update a state then it re-</w:t>
+      </w:r>
+      <w:proofErr w:type="gramStart"/>
+      <w:r>
+        <w:t>render</w:t>
+      </w:r>
+      <w:proofErr w:type="gramEnd"/>
+      <w:r>
+        <w:t xml:space="preserve"> the component </w:t>
+      </w:r>
+    </w:p>
+    <w:p>
+      <w:pPr>
+        <w:rPr>
+          <w:b/>
+          <w:bCs/>
+        </w:rPr>
+      </w:pPr>
+      <w:r>
+        <w:rPr>
+          <w:rStyle w:val="Heading2Char"/>
+        </w:rPr>
+        <w:t>Next JS tutorial in Hindi #5 File and folder</w:t>
+      </w:r>
+    </w:p>
+    <w:p/>
+    <w:p>
+      <w:proofErr w:type="spellStart"/>
+      <w:r>
+        <w:t>Package.json</w:t>
+      </w:r>
+      <w:proofErr w:type="spellEnd"/>
+      <w:r>
+        <w:t xml:space="preserve"> is very important file in project</w:t>
+      </w:r>
+    </w:p>
+    <w:p>
+      <w:r>
+        <w:t xml:space="preserve">Next.config.js for next </w:t>
+      </w:r>
+      <w:proofErr w:type="spellStart"/>
+      <w:r>
+        <w:t>js</w:t>
+      </w:r>
+      <w:proofErr w:type="spellEnd"/>
+      <w:r>
+        <w:t xml:space="preserve"> configuration</w:t>
+      </w:r>
+    </w:p>
+    <w:p>
+      <w:proofErr w:type="spellStart"/>
+      <w:r>
+        <w:t>Jsconfig.json</w:t>
+      </w:r>
+      <w:proofErr w:type="spellEnd"/>
+      <w:r>
+        <w:t xml:space="preserve"> for </w:t>
+      </w:r>
+      <w:proofErr w:type="spellStart"/>
+      <w:r>
+        <w:t>js</w:t>
+      </w:r>
+      <w:proofErr w:type="spellEnd"/>
+      <w:r>
+        <w:t xml:space="preserve"> configuration</w:t>
+      </w:r>
     </w:p>
     <w:p/>
     <w:sectPr>

</xml_diff>

<commit_message>
addding code of working with link and navigater
</commit_message>
<xml_diff>
--- a/next-js-doc.docx
+++ b/next-js-doc.docx
@@ -170,6 +170,399 @@
         <w:t xml:space="preserve"> configuration</w:t>
       </w:r>
     </w:p>
+    <w:p/>
+    <w:p/>
+    <w:p>
+      <w:pPr>
+        <w:pStyle w:val="Heading2"/>
+      </w:pPr>
+      <w:r>
+        <w:lastRenderedPageBreak/>
+        <w:t>Next JS tutorial in Hindi #6 Component Type | server component | Client component</w:t>
+      </w:r>
+    </w:p>
+    <w:p>
+      <w:r>
+        <w:drawing>
+          <wp:inline distT="0" distB="0" distL="0" distR="0" wp14:anchorId="4F4AEF79" wp14:editId="0B829513">
+            <wp:extent cx="5731510" cy="3220085"/>
+            <wp:effectExtent l="0" t="0" r="2540" b="0"/>
+            <wp:docPr id="1948899689" name="Picture 1"/>
+            <wp:cNvGraphicFramePr>
+              <a:graphicFrameLocks xmlns:a="http://schemas.openxmlformats.org/drawingml/2006/main" noChangeAspect="1"/>
+            </wp:cNvGraphicFramePr>
+            <a:graphic xmlns:a="http://schemas.openxmlformats.org/drawingml/2006/main">
+              <a:graphicData uri="http://schemas.openxmlformats.org/drawingml/2006/picture">
+                <pic:pic xmlns:pic="http://schemas.openxmlformats.org/drawingml/2006/picture">
+                  <pic:nvPicPr>
+                    <pic:cNvPr id="1948899689" name=""/>
+                    <pic:cNvPicPr/>
+                  </pic:nvPicPr>
+                  <pic:blipFill>
+                    <a:blip r:embed="rId5"/>
+                    <a:stretch>
+                      <a:fillRect/>
+                    </a:stretch>
+                  </pic:blipFill>
+                  <pic:spPr>
+                    <a:xfrm>
+                      <a:off x="0" y="0"/>
+                      <a:ext cx="5731510" cy="3220085"/>
+                    </a:xfrm>
+                    <a:prstGeom prst="rect">
+                      <a:avLst/>
+                    </a:prstGeom>
+                  </pic:spPr>
+                </pic:pic>
+              </a:graphicData>
+            </a:graphic>
+          </wp:inline>
+        </w:drawing>
+      </w:r>
+    </w:p>
+    <w:p/>
+    <w:p>
+      <w:r>
+        <w:drawing>
+          <wp:inline distT="0" distB="0" distL="0" distR="0" wp14:anchorId="5C503313" wp14:editId="04B5EE86">
+            <wp:extent cx="5731510" cy="3203575"/>
+            <wp:effectExtent l="0" t="0" r="2540" b="0"/>
+            <wp:docPr id="1380831181" name="Picture 1"/>
+            <wp:cNvGraphicFramePr>
+              <a:graphicFrameLocks xmlns:a="http://schemas.openxmlformats.org/drawingml/2006/main" noChangeAspect="1"/>
+            </wp:cNvGraphicFramePr>
+            <a:graphic xmlns:a="http://schemas.openxmlformats.org/drawingml/2006/main">
+              <a:graphicData uri="http://schemas.openxmlformats.org/drawingml/2006/picture">
+                <pic:pic xmlns:pic="http://schemas.openxmlformats.org/drawingml/2006/picture">
+                  <pic:nvPicPr>
+                    <pic:cNvPr id="1380831181" name=""/>
+                    <pic:cNvPicPr/>
+                  </pic:nvPicPr>
+                  <pic:blipFill>
+                    <a:blip r:embed="rId6"/>
+                    <a:stretch>
+                      <a:fillRect/>
+                    </a:stretch>
+                  </pic:blipFill>
+                  <pic:spPr>
+                    <a:xfrm>
+                      <a:off x="0" y="0"/>
+                      <a:ext cx="5731510" cy="3203575"/>
+                    </a:xfrm>
+                    <a:prstGeom prst="rect">
+                      <a:avLst/>
+                    </a:prstGeom>
+                  </pic:spPr>
+                </pic:pic>
+              </a:graphicData>
+            </a:graphic>
+          </wp:inline>
+        </w:drawing>
+      </w:r>
+    </w:p>
+    <w:p/>
+    <w:p>
+      <w:r>
+        <w:lastRenderedPageBreak/>
+        <w:drawing>
+          <wp:inline distT="0" distB="0" distL="0" distR="0" wp14:anchorId="018F5EFF" wp14:editId="130E09A1">
+            <wp:extent cx="5731510" cy="3232785"/>
+            <wp:effectExtent l="0" t="0" r="2540" b="5715"/>
+            <wp:docPr id="165014767" name="Picture 1"/>
+            <wp:cNvGraphicFramePr>
+              <a:graphicFrameLocks xmlns:a="http://schemas.openxmlformats.org/drawingml/2006/main" noChangeAspect="1"/>
+            </wp:cNvGraphicFramePr>
+            <a:graphic xmlns:a="http://schemas.openxmlformats.org/drawingml/2006/main">
+              <a:graphicData uri="http://schemas.openxmlformats.org/drawingml/2006/picture">
+                <pic:pic xmlns:pic="http://schemas.openxmlformats.org/drawingml/2006/picture">
+                  <pic:nvPicPr>
+                    <pic:cNvPr id="165014767" name=""/>
+                    <pic:cNvPicPr/>
+                  </pic:nvPicPr>
+                  <pic:blipFill>
+                    <a:blip r:embed="rId7"/>
+                    <a:stretch>
+                      <a:fillRect/>
+                    </a:stretch>
+                  </pic:blipFill>
+                  <pic:spPr>
+                    <a:xfrm>
+                      <a:off x="0" y="0"/>
+                      <a:ext cx="5731510" cy="3232785"/>
+                    </a:xfrm>
+                    <a:prstGeom prst="rect">
+                      <a:avLst/>
+                    </a:prstGeom>
+                  </pic:spPr>
+                </pic:pic>
+              </a:graphicData>
+            </a:graphic>
+          </wp:inline>
+        </w:drawing>
+      </w:r>
+    </w:p>
+    <w:p/>
+    <w:p>
+      <w:r>
+        <w:drawing>
+          <wp:inline distT="0" distB="0" distL="0" distR="0" wp14:anchorId="7E914EE3" wp14:editId="34673130">
+            <wp:extent cx="5731510" cy="3166745"/>
+            <wp:effectExtent l="0" t="0" r="2540" b="0"/>
+            <wp:docPr id="894615172" name="Picture 1"/>
+            <wp:cNvGraphicFramePr>
+              <a:graphicFrameLocks xmlns:a="http://schemas.openxmlformats.org/drawingml/2006/main" noChangeAspect="1"/>
+            </wp:cNvGraphicFramePr>
+            <a:graphic xmlns:a="http://schemas.openxmlformats.org/drawingml/2006/main">
+              <a:graphicData uri="http://schemas.openxmlformats.org/drawingml/2006/picture">
+                <pic:pic xmlns:pic="http://schemas.openxmlformats.org/drawingml/2006/picture">
+                  <pic:nvPicPr>
+                    <pic:cNvPr id="894615172" name=""/>
+                    <pic:cNvPicPr/>
+                  </pic:nvPicPr>
+                  <pic:blipFill>
+                    <a:blip r:embed="rId8"/>
+                    <a:stretch>
+                      <a:fillRect/>
+                    </a:stretch>
+                  </pic:blipFill>
+                  <pic:spPr>
+                    <a:xfrm>
+                      <a:off x="0" y="0"/>
+                      <a:ext cx="5731510" cy="3166745"/>
+                    </a:xfrm>
+                    <a:prstGeom prst="rect">
+                      <a:avLst/>
+                    </a:prstGeom>
+                  </pic:spPr>
+                </pic:pic>
+              </a:graphicData>
+            </a:graphic>
+          </wp:inline>
+        </w:drawing>
+      </w:r>
+    </w:p>
+    <w:p/>
+    <w:p>
+      <w:pPr>
+        <w:pStyle w:val="Heading2"/>
+      </w:pPr>
+      <w:r>
+        <w:t>Next JS tutorial in Hindi #7 Basic Routing | Create new Page in next.js</w:t>
+      </w:r>
+    </w:p>
+    <w:p/>
+    <w:p>
+      <w:r>
+        <w:lastRenderedPageBreak/>
+        <w:drawing>
+          <wp:inline distT="0" distB="0" distL="0" distR="0" wp14:anchorId="6E861B3A" wp14:editId="4C862248">
+            <wp:extent cx="5731510" cy="3209925"/>
+            <wp:effectExtent l="0" t="0" r="2540" b="9525"/>
+            <wp:docPr id="67013022" name="Picture 1"/>
+            <wp:cNvGraphicFramePr>
+              <a:graphicFrameLocks xmlns:a="http://schemas.openxmlformats.org/drawingml/2006/main" noChangeAspect="1"/>
+            </wp:cNvGraphicFramePr>
+            <a:graphic xmlns:a="http://schemas.openxmlformats.org/drawingml/2006/main">
+              <a:graphicData uri="http://schemas.openxmlformats.org/drawingml/2006/picture">
+                <pic:pic xmlns:pic="http://schemas.openxmlformats.org/drawingml/2006/picture">
+                  <pic:nvPicPr>
+                    <pic:cNvPr id="67013022" name=""/>
+                    <pic:cNvPicPr/>
+                  </pic:nvPicPr>
+                  <pic:blipFill>
+                    <a:blip r:embed="rId9"/>
+                    <a:stretch>
+                      <a:fillRect/>
+                    </a:stretch>
+                  </pic:blipFill>
+                  <pic:spPr>
+                    <a:xfrm>
+                      <a:off x="0" y="0"/>
+                      <a:ext cx="5731510" cy="3209925"/>
+                    </a:xfrm>
+                    <a:prstGeom prst="rect">
+                      <a:avLst/>
+                    </a:prstGeom>
+                  </pic:spPr>
+                </pic:pic>
+              </a:graphicData>
+            </a:graphic>
+          </wp:inline>
+        </w:drawing>
+      </w:r>
+    </w:p>
+    <w:p/>
+    <w:p>
+      <w:r>
+        <w:drawing>
+          <wp:inline distT="0" distB="0" distL="0" distR="0" wp14:anchorId="0D45E9CD" wp14:editId="46E0F192">
+            <wp:extent cx="5731510" cy="3051810"/>
+            <wp:effectExtent l="0" t="0" r="2540" b="0"/>
+            <wp:docPr id="731796711" name="Picture 1"/>
+            <wp:cNvGraphicFramePr>
+              <a:graphicFrameLocks xmlns:a="http://schemas.openxmlformats.org/drawingml/2006/main" noChangeAspect="1"/>
+            </wp:cNvGraphicFramePr>
+            <a:graphic xmlns:a="http://schemas.openxmlformats.org/drawingml/2006/main">
+              <a:graphicData uri="http://schemas.openxmlformats.org/drawingml/2006/picture">
+                <pic:pic xmlns:pic="http://schemas.openxmlformats.org/drawingml/2006/picture">
+                  <pic:nvPicPr>
+                    <pic:cNvPr id="731796711" name=""/>
+                    <pic:cNvPicPr/>
+                  </pic:nvPicPr>
+                  <pic:blipFill>
+                    <a:blip r:embed="rId10"/>
+                    <a:stretch>
+                      <a:fillRect/>
+                    </a:stretch>
+                  </pic:blipFill>
+                  <pic:spPr>
+                    <a:xfrm>
+                      <a:off x="0" y="0"/>
+                      <a:ext cx="5731510" cy="3051810"/>
+                    </a:xfrm>
+                    <a:prstGeom prst="rect">
+                      <a:avLst/>
+                    </a:prstGeom>
+                  </pic:spPr>
+                </pic:pic>
+              </a:graphicData>
+            </a:graphic>
+          </wp:inline>
+        </w:drawing>
+      </w:r>
+    </w:p>
+    <w:p/>
+    <w:p>
+      <w:r>
+        <w:lastRenderedPageBreak/>
+        <w:drawing>
+          <wp:inline distT="0" distB="0" distL="0" distR="0" wp14:anchorId="7CEC3EC9" wp14:editId="70B37CA9">
+            <wp:extent cx="5731510" cy="3009265"/>
+            <wp:effectExtent l="0" t="0" r="2540" b="635"/>
+            <wp:docPr id="914811559" name="Picture 1"/>
+            <wp:cNvGraphicFramePr>
+              <a:graphicFrameLocks xmlns:a="http://schemas.openxmlformats.org/drawingml/2006/main" noChangeAspect="1"/>
+            </wp:cNvGraphicFramePr>
+            <a:graphic xmlns:a="http://schemas.openxmlformats.org/drawingml/2006/main">
+              <a:graphicData uri="http://schemas.openxmlformats.org/drawingml/2006/picture">
+                <pic:pic xmlns:pic="http://schemas.openxmlformats.org/drawingml/2006/picture">
+                  <pic:nvPicPr>
+                    <pic:cNvPr id="914811559" name=""/>
+                    <pic:cNvPicPr/>
+                  </pic:nvPicPr>
+                  <pic:blipFill>
+                    <a:blip r:embed="rId11"/>
+                    <a:stretch>
+                      <a:fillRect/>
+                    </a:stretch>
+                  </pic:blipFill>
+                  <pic:spPr>
+                    <a:xfrm>
+                      <a:off x="0" y="0"/>
+                      <a:ext cx="5731510" cy="3009265"/>
+                    </a:xfrm>
+                    <a:prstGeom prst="rect">
+                      <a:avLst/>
+                    </a:prstGeom>
+                  </pic:spPr>
+                </pic:pic>
+              </a:graphicData>
+            </a:graphic>
+          </wp:inline>
+        </w:drawing>
+      </w:r>
+    </w:p>
+    <w:p/>
+    <w:p>
+      <w:pPr>
+        <w:pStyle w:val="Heading2"/>
+      </w:pPr>
+      <w:r>
+        <w:t>Next JS tutorial in Hindi #8 Link and Navigation in next.js 13.4</w:t>
+      </w:r>
+    </w:p>
+    <w:p>
+      <w:r>
+        <w:drawing>
+          <wp:inline distT="0" distB="0" distL="0" distR="0" wp14:anchorId="4F27C95F" wp14:editId="6B4C1AC1">
+            <wp:extent cx="5731510" cy="3221355"/>
+            <wp:effectExtent l="0" t="0" r="2540" b="0"/>
+            <wp:docPr id="1020385346" name="Picture 1"/>
+            <wp:cNvGraphicFramePr>
+              <a:graphicFrameLocks xmlns:a="http://schemas.openxmlformats.org/drawingml/2006/main" noChangeAspect="1"/>
+            </wp:cNvGraphicFramePr>
+            <a:graphic xmlns:a="http://schemas.openxmlformats.org/drawingml/2006/main">
+              <a:graphicData uri="http://schemas.openxmlformats.org/drawingml/2006/picture">
+                <pic:pic xmlns:pic="http://schemas.openxmlformats.org/drawingml/2006/picture">
+                  <pic:nvPicPr>
+                    <pic:cNvPr id="1020385346" name=""/>
+                    <pic:cNvPicPr/>
+                  </pic:nvPicPr>
+                  <pic:blipFill>
+                    <a:blip r:embed="rId12"/>
+                    <a:stretch>
+                      <a:fillRect/>
+                    </a:stretch>
+                  </pic:blipFill>
+                  <pic:spPr>
+                    <a:xfrm>
+                      <a:off x="0" y="0"/>
+                      <a:ext cx="5731510" cy="3221355"/>
+                    </a:xfrm>
+                    <a:prstGeom prst="rect">
+                      <a:avLst/>
+                    </a:prstGeom>
+                  </pic:spPr>
+                </pic:pic>
+              </a:graphicData>
+            </a:graphic>
+          </wp:inline>
+        </w:drawing>
+      </w:r>
+    </w:p>
+    <w:p/>
+    <w:p>
+      <w:r>
+        <w:lastRenderedPageBreak/>
+        <w:drawing>
+          <wp:inline distT="0" distB="0" distL="0" distR="0" wp14:anchorId="78189C4A" wp14:editId="18C76DE5">
+            <wp:extent cx="5731510" cy="3256915"/>
+            <wp:effectExtent l="0" t="0" r="2540" b="635"/>
+            <wp:docPr id="2054528601" name="Picture 1"/>
+            <wp:cNvGraphicFramePr>
+              <a:graphicFrameLocks xmlns:a="http://schemas.openxmlformats.org/drawingml/2006/main" noChangeAspect="1"/>
+            </wp:cNvGraphicFramePr>
+            <a:graphic xmlns:a="http://schemas.openxmlformats.org/drawingml/2006/main">
+              <a:graphicData uri="http://schemas.openxmlformats.org/drawingml/2006/picture">
+                <pic:pic xmlns:pic="http://schemas.openxmlformats.org/drawingml/2006/picture">
+                  <pic:nvPicPr>
+                    <pic:cNvPr id="2054528601" name=""/>
+                    <pic:cNvPicPr/>
+                  </pic:nvPicPr>
+                  <pic:blipFill>
+                    <a:blip r:embed="rId13"/>
+                    <a:stretch>
+                      <a:fillRect/>
+                    </a:stretch>
+                  </pic:blipFill>
+                  <pic:spPr>
+                    <a:xfrm>
+                      <a:off x="0" y="0"/>
+                      <a:ext cx="5731510" cy="3256915"/>
+                    </a:xfrm>
+                    <a:prstGeom prst="rect">
+                      <a:avLst/>
+                    </a:prstGeom>
+                  </pic:spPr>
+                </pic:pic>
+              </a:graphicData>
+            </a:graphic>
+          </wp:inline>
+        </w:drawing>
+      </w:r>
+    </w:p>
+    <w:p/>
+    <w:p/>
     <w:p/>
     <w:sectPr>
       <w:pgSz w:w="11906" w:h="16838"/>

</xml_diff>

<commit_message>
working with nested routing
</commit_message>
<xml_diff>
--- a/next-js-doc.docx
+++ b/next-js-doc.docx
@@ -522,6 +522,96 @@
     </w:p>
     <w:p/>
     <w:p>
+      <w:pPr>
+        <w:pStyle w:val="Heading2"/>
+      </w:pPr>
+      <w:r>
+        <w:lastRenderedPageBreak/>
+        <w:t>Next JS tutorial in Hindi #9 Nested Routing in next.js 13.4</w:t>
+      </w:r>
+    </w:p>
+    <w:p>
+      <w:r>
+        <w:drawing>
+          <wp:inline distT="0" distB="0" distL="0" distR="0" wp14:anchorId="5EC84C9F" wp14:editId="48883B44">
+            <wp:extent cx="5731510" cy="3222625"/>
+            <wp:effectExtent l="0" t="0" r="2540" b="0"/>
+            <wp:docPr id="1827438295" name="Picture 1"/>
+            <wp:cNvGraphicFramePr>
+              <a:graphicFrameLocks xmlns:a="http://schemas.openxmlformats.org/drawingml/2006/main" noChangeAspect="1"/>
+            </wp:cNvGraphicFramePr>
+            <a:graphic xmlns:a="http://schemas.openxmlformats.org/drawingml/2006/main">
+              <a:graphicData uri="http://schemas.openxmlformats.org/drawingml/2006/picture">
+                <pic:pic xmlns:pic="http://schemas.openxmlformats.org/drawingml/2006/picture">
+                  <pic:nvPicPr>
+                    <pic:cNvPr id="1827438295" name=""/>
+                    <pic:cNvPicPr/>
+                  </pic:nvPicPr>
+                  <pic:blipFill>
+                    <a:blip r:embed="rId13"/>
+                    <a:stretch>
+                      <a:fillRect/>
+                    </a:stretch>
+                  </pic:blipFill>
+                  <pic:spPr>
+                    <a:xfrm>
+                      <a:off x="0" y="0"/>
+                      <a:ext cx="5731510" cy="3222625"/>
+                    </a:xfrm>
+                    <a:prstGeom prst="rect">
+                      <a:avLst/>
+                    </a:prstGeom>
+                  </pic:spPr>
+                </pic:pic>
+              </a:graphicData>
+            </a:graphic>
+          </wp:inline>
+        </w:drawing>
+      </w:r>
+    </w:p>
+    <w:p/>
+    <w:p>
+      <w:r>
+        <w:drawing>
+          <wp:inline distT="0" distB="0" distL="0" distR="0" wp14:anchorId="3594577F" wp14:editId="7ABD9E9C">
+            <wp:extent cx="5731510" cy="3253740"/>
+            <wp:effectExtent l="0" t="0" r="2540" b="3810"/>
+            <wp:docPr id="725779485" name="Picture 1"/>
+            <wp:cNvGraphicFramePr>
+              <a:graphicFrameLocks xmlns:a="http://schemas.openxmlformats.org/drawingml/2006/main" noChangeAspect="1"/>
+            </wp:cNvGraphicFramePr>
+            <a:graphic xmlns:a="http://schemas.openxmlformats.org/drawingml/2006/main">
+              <a:graphicData uri="http://schemas.openxmlformats.org/drawingml/2006/picture">
+                <pic:pic xmlns:pic="http://schemas.openxmlformats.org/drawingml/2006/picture">
+                  <pic:nvPicPr>
+                    <pic:cNvPr id="725779485" name=""/>
+                    <pic:cNvPicPr/>
+                  </pic:nvPicPr>
+                  <pic:blipFill>
+                    <a:blip r:embed="rId14"/>
+                    <a:stretch>
+                      <a:fillRect/>
+                    </a:stretch>
+                  </pic:blipFill>
+                  <pic:spPr>
+                    <a:xfrm>
+                      <a:off x="0" y="0"/>
+                      <a:ext cx="5731510" cy="3253740"/>
+                    </a:xfrm>
+                    <a:prstGeom prst="rect">
+                      <a:avLst/>
+                    </a:prstGeom>
+                  </pic:spPr>
+                </pic:pic>
+              </a:graphicData>
+            </a:graphic>
+          </wp:inline>
+        </w:drawing>
+      </w:r>
+    </w:p>
+    <w:p/>
+    <w:p/>
+    <w:p>
       <w:r>
         <w:lastRenderedPageBreak/>
         <w:drawing>
@@ -540,7 +630,7 @@
                     <pic:cNvPicPr/>
                   </pic:nvPicPr>
                   <pic:blipFill>
-                    <a:blip r:embed="rId13"/>
+                    <a:blip r:embed="rId15"/>
                     <a:stretch>
                       <a:fillRect/>
                     </a:stretch>

</xml_diff>